<commit_message>
docs(intake): P1-02 가이드 삭제
"손자처럼 나 → 그분 방향으로는 적지 않아요"는 화살표 표기가 읽히지
않았다. 질문이 이미 "그분은 나의 ___" 형태이고 선지에 손자·손녀가 없어
방향을 틀리게 고를 수 없으므로 안내 자체가 필요 없다.
</commit_message>
<xml_diff>
--- a/ai/docs/Persona_Intake_시험지.docx
+++ b/ai/docs/Persona_Intake_시험지.docx
@@ -128,17 +128,6 @@
           <w:sz w:val="17"/>
         </w:rPr>
         <w:t xml:space="preserve">   하나 선택</w:t>
-      </w:r>
-      <w:r>
-        <w:br/>
-      </w:r>
-      <w:r>
-        <w:rPr>
-          <w:b w:val="0"/>
-          <w:color w:val="6E6E6E"/>
-          <w:sz w:val="17"/>
-        </w:rPr>
-        <w:t>가이드: "손자"처럼 나 → 그분 방향으로는 적지 않아요. 그분이 나에게 무엇인지로 적어주세요</w:t>
       </w:r>
     </w:p>
     <w:p>

</xml_diff>

<commit_message>
docs(intake): PART가 바뀔 때 쪽 넘김 추가
PART 1~5 마다 새 쪽에서 시작한다. 첫 PART 앞에는 넣지 않는다.
</commit_message>
<xml_diff>
--- a/ai/docs/Persona_Intake_시험지.docx
+++ b/ai/docs/Persona_Intake_시험지.docx
@@ -18,7 +18,7 @@
     </w:p>
     <w:p>
       <w:pPr>
-        <w:spacing w:before="520" w:after="180" w:line="312" w:lineRule="auto"/>
+        <w:spacing w:before="0" w:after="180" w:line="312" w:lineRule="auto"/>
         <w:ind w:left="0"/>
         <w:pBdr>
           <w:bottom w:val="single" w:sz="12" w:space="4" w:color="1F4E79"/>
@@ -855,8 +855,13 @@
       </w:r>
     </w:p>
     <w:p>
-      <w:pPr>
-        <w:spacing w:before="520" w:after="180" w:line="312" w:lineRule="auto"/>
+      <w:r>
+        <w:br w:type="page"/>
+      </w:r>
+    </w:p>
+    <w:p>
+      <w:pPr>
+        <w:spacing w:before="0" w:after="180" w:line="312" w:lineRule="auto"/>
         <w:ind w:left="0"/>
         <w:pBdr>
           <w:bottom w:val="single" w:sz="12" w:space="4" w:color="1F4E79"/>
@@ -2162,8 +2167,13 @@
       </w:r>
     </w:p>
     <w:p>
-      <w:pPr>
-        <w:spacing w:before="520" w:after="180" w:line="312" w:lineRule="auto"/>
+      <w:r>
+        <w:br w:type="page"/>
+      </w:r>
+    </w:p>
+    <w:p>
+      <w:pPr>
+        <w:spacing w:before="0" w:after="180" w:line="312" w:lineRule="auto"/>
         <w:ind w:left="0"/>
         <w:pBdr>
           <w:bottom w:val="single" w:sz="12" w:space="4" w:color="1F4E79"/>
@@ -8276,8 +8286,13 @@
       </w:r>
     </w:p>
     <w:p>
-      <w:pPr>
-        <w:spacing w:before="520" w:after="180" w:line="312" w:lineRule="auto"/>
+      <w:r>
+        <w:br w:type="page"/>
+      </w:r>
+    </w:p>
+    <w:p>
+      <w:pPr>
+        <w:spacing w:before="0" w:after="180" w:line="312" w:lineRule="auto"/>
         <w:ind w:left="0"/>
         <w:pBdr>
           <w:bottom w:val="single" w:sz="12" w:space="4" w:color="1F4E79"/>
@@ -9534,8 +9549,13 @@
       </w:r>
     </w:p>
     <w:p>
-      <w:pPr>
-        <w:spacing w:before="520" w:after="180" w:line="312" w:lineRule="auto"/>
+      <w:r>
+        <w:br w:type="page"/>
+      </w:r>
+    </w:p>
+    <w:p>
+      <w:pPr>
+        <w:spacing w:before="0" w:after="180" w:line="312" w:lineRule="auto"/>
         <w:ind w:left="0"/>
         <w:pBdr>
           <w:bottom w:val="single" w:sz="12" w:space="4" w:color="1F4E79"/>

</xml_diff>

<commit_message>
docs(intake): C-11을 C-10에 병합
둘 다 가드레일을 받는 문항이었다. 하나는 프리셋 체크, 하나는 그 밖의 것을
적는 칸이라 목적이 같다. 같은 구조인 M3-06 이 이미 한 문항이라 그쪽에
맞췄다. C 모듈은 C-01~C-10 이 된다.

한 열짜리 표에서 답의 머리행을 데이터 행으로 남기던 버그도 고쳤다.
신금자 C-11 에 "| # | 규칙 | 출처 | 상태 |" 가 한 줄 더 찍혀 있었다.
</commit_message>
<xml_diff>
--- a/ai/docs/Persona_Intake_시험지.docx
+++ b/ai/docs/Persona_Intake_시험지.docx
@@ -2197,6 +2197,17 @@
         </w:rPr>
         <w:t xml:space="preserve">   해당하는 것 모두</w:t>
       </w:r>
+      <w:r>
+        <w:br/>
+      </w:r>
+      <w:r>
+        <w:rPr>
+          <w:b w:val="0"/>
+          <w:color w:val="6E6E6E"/>
+          <w:sz w:val="17"/>
+        </w:rPr>
+        <w:t>가이드: "내가 진짜 할머니라고 말하지 않기"처럼 모든 페르소나에 공통으로 적용되는 규칙은 적지 않아도 돼요. 말투(유행어·영어 등)는 뒤에서 따로 물어요.</w:t>
+      </w:r>
     </w:p>
     <w:p>
       <w:pPr>
@@ -2312,7 +2323,7 @@
     </w:p>
     <w:p>
       <w:pPr>
-        <w:keepNext w:val="0"/>
+        <w:keepNext/>
         <w:keepLines/>
         <w:spacing w:before="0" w:after="80" w:line="312" w:lineRule="auto"/>
         <w:ind w:left="283"/>
@@ -2328,44 +2339,18 @@
     </w:p>
     <w:p>
       <w:pPr>
-        <w:spacing w:before="300" w:after="100" w:line="300" w:lineRule="auto"/>
-        <w:ind w:left="113" w:right="113"/>
         <w:keepNext/>
         <w:keepLines/>
-        <w:shd w:val="clear" w:fill="F1F5F9"/>
-      </w:pPr>
-      <w:r>
-        <w:rPr>
-          <w:b/>
-          <w:sz w:val="21"/>
-        </w:rPr>
-        <w:t xml:space="preserve">C-11  </w:t>
-      </w:r>
-      <w:r>
-        <w:rPr>
-          <w:b/>
+        <w:spacing w:before="0" w:after="80" w:line="312" w:lineRule="auto"/>
+        <w:ind w:left="227"/>
+      </w:pPr>
+      <w:r>
+        <w:rPr>
+          <w:b w:val="0"/>
           <w:color w:val="1A1A1A"/>
-          <w:sz w:val="21"/>
-        </w:rPr>
-        <w:t>위에 없는 규칙이 있으면 한 줄에 하나씩.</w:t>
-      </w:r>
-      <w:r>
-        <w:rPr>
-          <w:color w:val="6E6E6E"/>
-          <w:sz w:val="17"/>
-        </w:rPr>
-        <w:t xml:space="preserve">   표 0~5행</w:t>
-      </w:r>
-      <w:r>
-        <w:br/>
-      </w:r>
-      <w:r>
-        <w:rPr>
-          <w:b w:val="0"/>
-          <w:color w:val="6E6E6E"/>
-          <w:sz w:val="17"/>
-        </w:rPr>
-        <w:t>가이드: "내가 진짜 할머니라고 말하지 않기"처럼 모든 페르소나에 공통으로 적용되는 규칙은 적지 않아도 돼요. 말투(유행어·영어 등)는 뒤에서 따로 물어요.</w:t>
+          <w:sz w:val="20"/>
+        </w:rPr>
+        <w:t>위에 없는 규칙 (0~5행, 한 줄에 하나):</w:t>
       </w:r>
     </w:p>
     <w:tbl>

</xml_diff>

<commit_message>
docs(intake): C-10에 "대신 어떻게" 열 추가
작성자들이 금지와 대안을 한 줄에 같이 쓰고 있었다 (다섯 줄 중 둘).
  "서비스에 회의적인 질문에 방어적으로 반박하지 않기 — 할머니 이야기로 돌아가 설명"
  ""사랑한다"를 아빠에게는 과하게 쓰지 않기 — 손주에게만 자연스러움"

막을 게 아니라 칸을 만드는 게 맞다. 금지만 있으면 페르소나가 입을 닫는데,
대안이 있으면 "대신 이렇게"로 넘어간다. 고정 안전블록도 그 짝으로 돼 있다.

두 작성본의 답도 두 칸으로 갈랐다.
</commit_message>
<xml_diff>
--- a/ai/docs/Persona_Intake_시험지.docx
+++ b/ai/docs/Persona_Intake_시험지.docx
@@ -2360,7 +2360,8 @@
         <w:tblLook w:firstColumn="1" w:firstRow="1" w:lastColumn="0" w:lastRow="0" w:noHBand="0" w:noVBand="1" w:val="04A0"/>
       </w:tblPr>
       <w:tblGrid>
-        <w:gridCol w:w="9746"/>
+        <w:gridCol w:w="4873"/>
+        <w:gridCol w:w="4873"/>
       </w:tblGrid>
       <w:tr>
         <w:trPr>
@@ -2368,7 +2369,7 @@
         </w:trPr>
         <w:tc>
           <w:tcPr>
-            <w:tcW w:type="dxa" w:w="9746"/>
+            <w:tcW w:type="dxa" w:w="4873"/>
           </w:tcPr>
           <w:p>
             <w:pPr>
@@ -2385,6 +2386,35 @@
             </w:r>
           </w:p>
         </w:tc>
+        <w:tc>
+          <w:tcPr>
+            <w:tcW w:type="dxa" w:w="4873"/>
+          </w:tcPr>
+          <w:p>
+            <w:pPr>
+              <w:spacing w:after="60"/>
+              <w:shd w:val="clear" w:fill="EFEFEF"/>
+            </w:pPr>
+            <w:r>
+              <w:rPr>
+                <w:b/>
+                <w:color w:val="1A1A1A"/>
+                <w:sz w:val="17"/>
+              </w:rPr>
+              <w:t>대신 어떻게 하면 좋을까요</w:t>
+            </w:r>
+            <w:r>
+              <w:br/>
+            </w:r>
+            <w:r>
+              <w:rPr>
+                <w:color w:val="6E6E6E"/>
+                <w:sz w:val="15"/>
+              </w:rPr>
+              <w:t>선택</w:t>
+            </w:r>
+          </w:p>
+        </w:tc>
       </w:tr>
       <w:tr>
         <w:trPr>
@@ -2392,7 +2422,17 @@
         </w:trPr>
         <w:tc>
           <w:tcPr>
-            <w:tcW w:type="dxa" w:w="9746"/>
+            <w:tcW w:type="dxa" w:w="4873"/>
+          </w:tcPr>
+          <w:p>
+            <w:pPr>
+              <w:spacing w:after="60"/>
+            </w:pPr>
+          </w:p>
+        </w:tc>
+        <w:tc>
+          <w:tcPr>
+            <w:tcW w:type="dxa" w:w="4873"/>
           </w:tcPr>
           <w:p>
             <w:pPr>
@@ -2407,7 +2447,17 @@
         </w:trPr>
         <w:tc>
           <w:tcPr>
-            <w:tcW w:type="dxa" w:w="9746"/>
+            <w:tcW w:type="dxa" w:w="4873"/>
+          </w:tcPr>
+          <w:p>
+            <w:pPr>
+              <w:spacing w:after="60"/>
+            </w:pPr>
+          </w:p>
+        </w:tc>
+        <w:tc>
+          <w:tcPr>
+            <w:tcW w:type="dxa" w:w="4873"/>
           </w:tcPr>
           <w:p>
             <w:pPr>

</xml_diff>

<commit_message>
docs(intake): M1-01, M1-02 가이드 삭제
"모름에 체크해주세요"는 옆의 체크박스로 이미 보이고, "시·군 단위로"는
예시 없이 규칙만 있어 덜어냈다.
</commit_message>
<xml_diff>
--- a/ai/docs/Persona_Intake_시험지.docx
+++ b/ai/docs/Persona_Intake_시험지.docx
@@ -2549,17 +2549,6 @@
         </w:rPr>
         <w:t xml:space="preserve">   숫자</w:t>
       </w:r>
-      <w:r>
-        <w:br/>
-      </w:r>
-      <w:r>
-        <w:rPr>
-          <w:b w:val="0"/>
-          <w:color w:val="6E6E6E"/>
-          <w:sz w:val="17"/>
-        </w:rPr>
-        <w:t>가이드: 모르면 비워두지 말고 "모름"에 체크해주세요. 빈칸은 나중에 다시 여쭤봅니다.</w:t>
-      </w:r>
     </w:p>
     <w:p>
       <w:pPr>
@@ -2606,17 +2595,6 @@
           <w:sz w:val="17"/>
         </w:rPr>
         <w:t xml:space="preserve">   단답 20자</w:t>
-      </w:r>
-      <w:r>
-        <w:br/>
-      </w:r>
-      <w:r>
-        <w:rPr>
-          <w:b w:val="0"/>
-          <w:color w:val="6E6E6E"/>
-          <w:sz w:val="17"/>
-        </w:rPr>
-        <w:t>가이드: 시·군 단위로 적어주세요.</w:t>
       </w:r>
     </w:p>
     <w:p>

</xml_diff>

<commit_message>
docs(intake): M1-08의 남는 서술 칸 삭제 및 M1-09 라벨 정리
- M1-08 에 "직접 입력 → ___" 과 "서술 (선택, 1~2문장):" 이 같이 있었다.
  직접 입력이 이미 그 자리라 뒤엣것을 지웠다. 두 작성본 다 쓰지 않았다
- M1-09 의 "서술 (선택, 1~2문장): 기도하거나 …" 라벨을 문장으로 풀고 쓸
  자리를 붙였다. 신금자 답(성당 이야기)이 갈 곳이 없었다
- M1-09 가이드 "죽음에 대한 생각은 여기 쓰지 않아요" 삭제
- M4-01 의 "일화 (선택, 1~3문장): 골라준 말 중 하나에 대해" 도 같은 모양으로
</commit_message>
<xml_diff>
--- a/ai/docs/Persona_Intake_시험지.docx
+++ b/ai/docs/Persona_Intake_시험지.docx
@@ -3181,7 +3181,7 @@
     </w:p>
     <w:p>
       <w:pPr>
-        <w:keepNext/>
+        <w:keepNext w:val="0"/>
         <w:keepLines/>
         <w:spacing w:before="0" w:after="80" w:line="312" w:lineRule="auto"/>
         <w:ind w:left="227"/>
@@ -3197,6 +3197,37 @@
     </w:p>
     <w:p>
       <w:pPr>
+        <w:spacing w:before="300" w:after="100" w:line="300" w:lineRule="auto"/>
+        <w:ind w:left="113" w:right="113"/>
+        <w:keepNext/>
+        <w:keepLines/>
+        <w:shd w:val="clear" w:fill="F1F5F9"/>
+      </w:pPr>
+      <w:r>
+        <w:rPr>
+          <w:b/>
+          <w:sz w:val="21"/>
+        </w:rPr>
+        <w:t xml:space="preserve">M1-09  </w:t>
+      </w:r>
+      <w:r>
+        <w:rPr>
+          <w:b/>
+          <w:color w:val="1A1A1A"/>
+          <w:sz w:val="21"/>
+        </w:rPr>
+        <w:t>종교나 신앙이 있으셨나요?</w:t>
+      </w:r>
+      <w:r>
+        <w:rPr>
+          <w:color w:val="6E6E6E"/>
+          <w:sz w:val="17"/>
+        </w:rPr>
+        <w:t xml:space="preserve">   하나 선택 + 서술</w:t>
+      </w:r>
+    </w:p>
+    <w:p>
+      <w:pPr>
         <w:keepNext/>
         <w:keepLines/>
         <w:spacing w:before="0" w:after="80" w:line="312" w:lineRule="auto"/>
@@ -3208,7 +3239,23 @@
           <w:color w:val="1A1A1A"/>
           <w:sz w:val="20"/>
         </w:rPr>
-        <w:t>서술 (선택, 1~2문장):</w:t>
+        <w:t>□ 없음  □ 기독교  □ 천주교  □ 불교  □ 기타 → ____________________  □ 모름</w:t>
+      </w:r>
+    </w:p>
+    <w:p>
+      <w:pPr>
+        <w:keepNext/>
+        <w:keepLines/>
+        <w:spacing w:before="0" w:after="80" w:line="312" w:lineRule="auto"/>
+        <w:ind w:left="227"/>
+      </w:pPr>
+      <w:r>
+        <w:rPr>
+          <w:b w:val="0"/>
+          <w:color w:val="1A1A1A"/>
+          <w:sz w:val="20"/>
+        </w:rPr>
+        <w:t>기도하거나 마음을 의지하던 습관, 바뀐 계기가 있으면 적어주세요. (선택, 1~2문장)</w:t>
       </w:r>
     </w:p>
     <w:p>
@@ -3226,80 +3273,6 @@
           <w:sz w:val="20"/>
         </w:rPr>
         <w:t xml:space="preserve"> </w:t>
-      </w:r>
-    </w:p>
-    <w:p>
-      <w:pPr>
-        <w:spacing w:before="300" w:after="100" w:line="300" w:lineRule="auto"/>
-        <w:ind w:left="113" w:right="113"/>
-        <w:keepNext/>
-        <w:keepLines/>
-        <w:shd w:val="clear" w:fill="F1F5F9"/>
-      </w:pPr>
-      <w:r>
-        <w:rPr>
-          <w:b/>
-          <w:sz w:val="21"/>
-        </w:rPr>
-        <w:t xml:space="preserve">M1-09  </w:t>
-      </w:r>
-      <w:r>
-        <w:rPr>
-          <w:b/>
-          <w:color w:val="1A1A1A"/>
-          <w:sz w:val="21"/>
-        </w:rPr>
-        <w:t>종교나 신앙이 있으셨나요?</w:t>
-      </w:r>
-      <w:r>
-        <w:rPr>
-          <w:color w:val="6E6E6E"/>
-          <w:sz w:val="17"/>
-        </w:rPr>
-        <w:t xml:space="preserve">   하나 선택 + 서술</w:t>
-      </w:r>
-      <w:r>
-        <w:br/>
-      </w:r>
-      <w:r>
-        <w:rPr>
-          <w:b w:val="0"/>
-          <w:color w:val="6E6E6E"/>
-          <w:sz w:val="17"/>
-        </w:rPr>
-        <w:t>가이드: 죽음에 대한 생각은 여기 쓰지 않아요.</w:t>
-      </w:r>
-    </w:p>
-    <w:p>
-      <w:pPr>
-        <w:keepNext/>
-        <w:keepLines/>
-        <w:spacing w:before="0" w:after="80" w:line="312" w:lineRule="auto"/>
-        <w:ind w:left="227"/>
-      </w:pPr>
-      <w:r>
-        <w:rPr>
-          <w:b w:val="0"/>
-          <w:color w:val="1A1A1A"/>
-          <w:sz w:val="20"/>
-        </w:rPr>
-        <w:t>□ 없음  □ 기독교  □ 천주교  □ 불교  □ 기타 → ____________________  □ 모름</w:t>
-      </w:r>
-    </w:p>
-    <w:p>
-      <w:pPr>
-        <w:keepNext w:val="0"/>
-        <w:keepLines/>
-        <w:spacing w:before="0" w:after="80" w:line="312" w:lineRule="auto"/>
-        <w:ind w:left="227"/>
-      </w:pPr>
-      <w:r>
-        <w:rPr>
-          <w:b w:val="0"/>
-          <w:color w:val="1A1A1A"/>
-          <w:sz w:val="20"/>
-        </w:rPr>
-        <w:t>서술 (선택, 1~2문장): 기도하거나 마음을 의지하던 습관, 바뀐 계기</w:t>
       </w:r>
     </w:p>
     <w:p>
@@ -5031,7 +5004,7 @@
           <w:color w:val="1A1A1A"/>
           <w:sz w:val="20"/>
         </w:rPr>
-        <w:t>일화 (선택, 1~3문장): 골라준 말 중 하나에 대해</w:t>
+        <w:t>골라준 말 중 하나에 얽힌 일화가 있으면 적어주세요. (선택, 1~3문장)</w:t>
       </w:r>
     </w:p>
     <w:p>

</xml_diff>

<commit_message>
docs(intake): 종교 서술을 M1-10으로 분리
M1-09 만 "하나 선택 + 서술" 겸용이라 M1 안에서 튀었다. 서술을 문항으로
빼면 M1-02(고향 값) → M1-03(고향은 어떤 곳) 과 같은 짝이 된다.

  M1-09  종교나 신앙이 있으셨나요?                하나 선택
  M1-10  기도하거나 마음을 의지하던 습관이 있으셨나요?
         종교가 바뀐 계기가 있다면 함께 들려주세요.   서술 1~2문장 · 선택

신금자의 "무교 → 절 → 성당" 궤적이 선지 하나로는 안 담겨 그대로 살렸다.
</commit_message>
<xml_diff>
--- a/ai/docs/Persona_Intake_시험지.docx
+++ b/ai/docs/Persona_Intake_시험지.docx
@@ -3223,12 +3223,12 @@
           <w:color w:val="6E6E6E"/>
           <w:sz w:val="17"/>
         </w:rPr>
-        <w:t xml:space="preserve">   하나 선택 + 서술</w:t>
-      </w:r>
-    </w:p>
-    <w:p>
-      <w:pPr>
-        <w:keepNext/>
+        <w:t xml:space="preserve">   하나 선택</w:t>
+      </w:r>
+    </w:p>
+    <w:p>
+      <w:pPr>
+        <w:keepNext w:val="0"/>
         <w:keepLines/>
         <w:spacing w:before="0" w:after="80" w:line="312" w:lineRule="auto"/>
         <w:ind w:left="227"/>
@@ -3244,18 +3244,50 @@
     </w:p>
     <w:p>
       <w:pPr>
+        <w:spacing w:before="300" w:after="100" w:line="300" w:lineRule="auto"/>
+        <w:ind w:left="113" w:right="113"/>
         <w:keepNext/>
         <w:keepLines/>
-        <w:spacing w:before="0" w:after="80" w:line="312" w:lineRule="auto"/>
+        <w:shd w:val="clear" w:fill="F1F5F9"/>
+      </w:pPr>
+      <w:r>
+        <w:rPr>
+          <w:b/>
+          <w:sz w:val="21"/>
+        </w:rPr>
+        <w:t xml:space="preserve">M1-10  </w:t>
+      </w:r>
+      <w:r>
+        <w:rPr>
+          <w:b/>
+          <w:color w:val="1A1A1A"/>
+          <w:sz w:val="21"/>
+        </w:rPr>
+        <w:t>기도하거나 마음을 의지하던 습관이 있으셨나요? 종교가 바뀐 계기가 있다면 함께 들려주세요.</w:t>
+      </w:r>
+      <w:r>
+        <w:rPr>
+          <w:color w:val="6E6E6E"/>
+          <w:sz w:val="17"/>
+        </w:rPr>
+        <w:t xml:space="preserve">   서술 1~2문장 · 선택</w:t>
+      </w:r>
+    </w:p>
+    <w:p>
+      <w:pPr>
+        <w:spacing w:before="0" w:after="120" w:line="276" w:lineRule="auto"/>
         <w:ind w:left="227"/>
-      </w:pPr>
-      <w:r>
-        <w:rPr>
-          <w:b w:val="0"/>
-          <w:color w:val="1A1A1A"/>
+        <w:keepNext/>
+        <w:keepLines/>
+        <w:pBdr>
+          <w:bottom w:val="single" w:sz="6" w:space="4" w:color="9A9A9A"/>
+        </w:pBdr>
+      </w:pPr>
+      <w:r>
+        <w:rPr>
           <w:sz w:val="20"/>
         </w:rPr>
-        <w:t>기도하거나 마음을 의지하던 습관, 바뀐 계기가 있으면 적어주세요. (선택, 1~2문장)</w:t>
+        <w:t xml:space="preserve"> </w:t>
       </w:r>
     </w:p>
     <w:p>

</xml_diff>